<commit_message>
Họp 2/8 Cập nhật báo cáo
</commit_message>
<xml_diff>
--- a/report/Báo cáo.docx
+++ b/report/Báo cáo.docx
@@ -3408,13 +3408,13 @@
         </w:rPr>
         <w:fldChar w:fldCharType="separate"/>
       </w:r>
-      <w:hyperlink w:anchor="_Toc236523154" w:history="1">
+      <w:hyperlink w:anchor="_Toc236593279" w:history="1">
         <w:r>
           <w:rPr>
             <w:rStyle w:val="Hyperlink"/>
             <w:noProof/>
           </w:rPr>
-          <w:t>Hình 1.1</w:t>
+          <w:t>Hình 2.1</w:t>
         </w:r>
         <w:r>
           <w:rPr>
@@ -3422,23 +3422,185 @@
             <w:noProof/>
             <w:lang w:val="en-US"/>
           </w:rPr>
-          <w:t xml:space="preserve">. Sơ đồ </w:t>
-        </w:r>
+          <w:t>. Sơ đồ Cơ cấu tổ chức</w:t>
+        </w:r>
+        <w:r>
+          <w:rPr>
+            <w:noProof/>
+            <w:webHidden/>
+          </w:rPr>
+          <w:tab/>
+        </w:r>
+        <w:r>
+          <w:rPr>
+            <w:noProof/>
+            <w:webHidden/>
+          </w:rPr>
+          <w:fldChar w:fldCharType="begin"/>
+        </w:r>
+        <w:r>
+          <w:rPr>
+            <w:noProof/>
+            <w:webHidden/>
+          </w:rPr>
+          <w:instrText xml:space="preserve"> PAGEREF _Toc236593279 \h </w:instrText>
+        </w:r>
+        <w:r>
+          <w:rPr>
+            <w:noProof/>
+            <w:webHidden/>
+          </w:rPr>
+        </w:r>
+        <w:r>
+          <w:rPr>
+            <w:noProof/>
+            <w:webHidden/>
+          </w:rPr>
+          <w:fldChar w:fldCharType="separate"/>
+        </w:r>
+        <w:r>
+          <w:rPr>
+            <w:noProof/>
+            <w:webHidden/>
+          </w:rPr>
+          <w:t>3</w:t>
+        </w:r>
+        <w:r>
+          <w:rPr>
+            <w:noProof/>
+            <w:webHidden/>
+          </w:rPr>
+          <w:fldChar w:fldCharType="end"/>
+        </w:r>
+      </w:hyperlink>
+    </w:p>
+    <w:p>
+      <w:pPr>
+        <w:pStyle w:val="TableofFigures"/>
+        <w:tabs>
+          <w:tab w:val="right" w:leader="dot" w:pos="8777"/>
+        </w:tabs>
+        <w:rPr>
+          <w:rFonts w:asciiTheme="minorHAnsi" w:eastAsiaTheme="minorEastAsia" w:hAnsiTheme="minorHAnsi"/>
+          <w:noProof/>
+          <w:kern w:val="2"/>
+          <w:sz w:val="24"/>
+          <w:szCs w:val="24"/>
+          <w:lang w:eastAsia="vi-VN"/>
+          <w14:ligatures w14:val="standardContextual"/>
+        </w:rPr>
+      </w:pPr>
+      <w:hyperlink w:anchor="_Toc236593280" w:history="1">
         <w:r>
           <w:rPr>
             <w:rStyle w:val="Hyperlink"/>
             <w:noProof/>
+          </w:rPr>
+          <w:t>Hình 2.1. Sơ đồ Kiến trúc quy trình nghiệp vụ</w:t>
+        </w:r>
+        <w:r>
+          <w:rPr>
+            <w:noProof/>
+            <w:webHidden/>
+          </w:rPr>
+          <w:tab/>
+        </w:r>
+        <w:r>
+          <w:rPr>
+            <w:noProof/>
+            <w:webHidden/>
+          </w:rPr>
+          <w:fldChar w:fldCharType="begin"/>
+        </w:r>
+        <w:r>
+          <w:rPr>
+            <w:noProof/>
+            <w:webHidden/>
+          </w:rPr>
+          <w:instrText xml:space="preserve"> PAGEREF _Toc236593280 \h </w:instrText>
+        </w:r>
+        <w:r>
+          <w:rPr>
+            <w:noProof/>
+            <w:webHidden/>
+          </w:rPr>
+        </w:r>
+        <w:r>
+          <w:rPr>
+            <w:noProof/>
+            <w:webHidden/>
+          </w:rPr>
+          <w:fldChar w:fldCharType="separate"/>
+        </w:r>
+        <w:r>
+          <w:rPr>
+            <w:noProof/>
+            <w:webHidden/>
+          </w:rPr>
+          <w:t>4</w:t>
+        </w:r>
+        <w:r>
+          <w:rPr>
+            <w:noProof/>
+            <w:webHidden/>
+          </w:rPr>
+          <w:fldChar w:fldCharType="end"/>
+        </w:r>
+      </w:hyperlink>
+    </w:p>
+    <w:p>
+      <w:pPr>
+        <w:pStyle w:val="TableofFigures"/>
+        <w:tabs>
+          <w:tab w:val="right" w:leader="dot" w:pos="8777"/>
+        </w:tabs>
+        <w:rPr>
+          <w:rFonts w:asciiTheme="minorHAnsi" w:eastAsiaTheme="minorEastAsia" w:hAnsiTheme="minorHAnsi"/>
+          <w:noProof/>
+          <w:kern w:val="2"/>
+          <w:sz w:val="24"/>
+          <w:szCs w:val="24"/>
+          <w:lang w:eastAsia="vi-VN"/>
+          <w14:ligatures w14:val="standardContextual"/>
+        </w:rPr>
+      </w:pPr>
+      <w:hyperlink w:anchor="_Toc236593281" w:history="1">
+        <w:r>
+          <w:rPr>
+            <w:rStyle w:val="Hyperlink"/>
+            <w:noProof/>
+          </w:rPr>
+          <w:t>Hình 2.2</w:t>
+        </w:r>
+        <w:r>
+          <w:rPr>
+            <w:rStyle w:val="Hyperlink"/>
+            <w:noProof/>
             <w:lang w:val="en-US"/>
           </w:rPr>
-          <w:t>C</w:t>
+          <w:t>. Chuỗi giá trị q</w:t>
         </w:r>
         <w:r>
           <w:rPr>
             <w:rStyle w:val="Hyperlink"/>
             <w:noProof/>
+          </w:rPr>
+          <w:t xml:space="preserve">uy trình </w:t>
+        </w:r>
+        <w:r>
+          <w:rPr>
+            <w:rStyle w:val="Hyperlink"/>
+            <w:noProof/>
             <w:lang w:val="en-US"/>
           </w:rPr>
-          <w:t>ơ cấu tổ chứ 1</w:t>
+          <w:t>h</w:t>
+        </w:r>
+        <w:r>
+          <w:rPr>
+            <w:rStyle w:val="Hyperlink"/>
+            <w:noProof/>
+          </w:rPr>
+          <w:t>oạch định chiến lược</w:t>
         </w:r>
         <w:r>
           <w:rPr>
@@ -3459,7 +3621,7 @@
             <w:noProof/>
             <w:webHidden/>
           </w:rPr>
-          <w:instrText xml:space="preserve"> PAGEREF _Toc236523154 \h </w:instrText>
+          <w:instrText xml:space="preserve"> PAGEREF _Toc236593281 \h </w:instrText>
         </w:r>
         <w:r>
           <w:rPr>
@@ -3479,7 +3641,7 @@
             <w:noProof/>
             <w:webHidden/>
           </w:rPr>
-          <w:t>3</w:t>
+          <w:t>4</w:t>
         </w:r>
         <w:r>
           <w:rPr>
@@ -3512,24 +3674,37 @@
     </w:p>
     <w:p>
       <w:pPr>
+        <w:spacing w:before="0" w:after="200" w:line="276" w:lineRule="auto"/>
+        <w:rPr>
+          <w:rFonts w:eastAsiaTheme="majorEastAsia" w:cs="Times New Roman"/>
+          <w:b/>
+          <w:spacing w:val="5"/>
+          <w:kern w:val="28"/>
+          <w:sz w:val="28"/>
+          <w:szCs w:val="52"/>
+          <w:lang w:val="en-US"/>
+        </w:rPr>
+      </w:pPr>
+      <w:r>
+        <w:rPr>
+          <w:rFonts w:cs="Times New Roman"/>
+          <w:lang w:val="en-US"/>
+        </w:rPr>
+        <w:br w:type="page"/>
+      </w:r>
+    </w:p>
+    <w:p>
+      <w:pPr>
         <w:pStyle w:val="Title"/>
         <w:rPr>
           <w:rFonts w:cs="Times New Roman"/>
-          <w:lang w:val="en-US"/>
-        </w:rPr>
-      </w:pPr>
-    </w:p>
-    <w:p>
-      <w:pPr>
-        <w:pStyle w:val="Title"/>
+        </w:rPr>
+      </w:pPr>
+      <w:r>
         <w:rPr>
           <w:rFonts w:cs="Times New Roman"/>
         </w:rPr>
-      </w:pPr>
-      <w:r>
-        <w:rPr>
-          <w:rFonts w:cs="Times New Roman"/>
-        </w:rPr>
+        <w:lastRenderedPageBreak/>
         <w:t>DANH MỤC BẢNG</w:t>
       </w:r>
     </w:p>
@@ -5895,7 +6070,7 @@
     </w:p>
     <w:p>
       <w:pPr>
-        <w:pStyle w:val="LBody"/>
+        <w:pStyle w:val="Heading1"/>
       </w:pPr>
       <w:r>
         <w:rPr>
@@ -5933,8 +6108,14 @@
     <w:p>
       <w:pPr>
         <w:pStyle w:val="LBody"/>
-      </w:pPr>
-      <w:r>
+        <w:rPr>
+          <w:lang w:val="vi-VN"/>
+        </w:rPr>
+      </w:pPr>
+      <w:r>
+        <w:rPr>
+          <w:lang w:val="vi-VN"/>
+        </w:rPr>
         <w:t>Phúc Long được thành lập vào năm 1968 tại vùng đất chè nổi tiếng Bảo Lộc (Lâm Đồng). Qua hơn 50 năm phát triển, Phúc Long đã khẳng định vị thế thương hiệu Trà &amp; Cà phê đậm vị hàng đầu Việt Nam. Năm 2021-2022, Tập đoàn Masan chính thức thâu tóm Phúc Long Heritage, mở ra giai đoạn bùng nổ quy mô chuỗi cửa hàng kết hợp giữa mô hình Flagship cao cấp và các điểm bán Kiosk tinh gọn trong hệ sinh thái WIN / WinMart+.</w:t>
       </w:r>
     </w:p>
@@ -5944,34 +6125,7 @@
       </w:pPr>
       <w:bookmarkStart w:id="2" w:name="_Toc236522134"/>
       <w:r>
-        <w:rPr>
-          <w:lang w:val="en-US"/>
-        </w:rPr>
-        <w:t xml:space="preserve">Sứ mệnh và </w:t>
-      </w:r>
-      <w:r>
-        <w:rPr>
-          <w:lang w:val="en-US"/>
-        </w:rPr>
-        <w:t xml:space="preserve">giá </w:t>
-      </w:r>
-      <w:r>
-        <w:rPr>
-          <w:lang w:val="en-US"/>
-        </w:rPr>
-        <w:t xml:space="preserve">trị </w:t>
-      </w:r>
-      <w:r>
-        <w:rPr>
-          <w:lang w:val="en-US"/>
-        </w:rPr>
-        <w:t xml:space="preserve">cốt </w:t>
-      </w:r>
-      <w:r>
-        <w:rPr>
-          <w:lang w:val="en-US"/>
-        </w:rPr>
-        <w:t>lõi</w:t>
+        <w:t>Sứ mệnh và giá trị cốt lõi</w:t>
       </w:r>
       <w:bookmarkEnd w:id="2"/>
     </w:p>
@@ -5994,8 +6148,14 @@
     <w:p>
       <w:pPr>
         <w:pStyle w:val="LBody"/>
-      </w:pPr>
-      <w:r>
+        <w:rPr>
+          <w:lang w:val="vi-VN"/>
+        </w:rPr>
+      </w:pPr>
+      <w:r>
+        <w:rPr>
+          <w:lang w:val="vi-VN"/>
+        </w:rPr>
         <w:t>Giá trị cốt lõi:</w:t>
       </w:r>
     </w:p>
@@ -6031,96 +6191,112 @@
       <w:pPr>
         <w:pStyle w:val="LBody"/>
         <w:rPr>
-          <w:lang w:val="en-US"/>
-        </w:rPr>
-      </w:pPr>
-      <w:r>
-        <w:rPr>
           <w:lang w:val="vi-VN"/>
         </w:rPr>
+      </w:pPr>
+      <w:r>
+        <w:rPr>
+          <w:lang w:val="vi-VN"/>
+        </w:rPr>
         <w:t>Vận hành chuẩn mực: Mọi điểm bán đều hoạt động theo quy trình SOP nghiêm ngặt và tiêu chuẩn an toàn thực phẩm.</w:t>
       </w:r>
     </w:p>
     <w:p>
       <w:pPr>
         <w:pStyle w:val="Heading2"/>
-        <w:rPr>
-          <w:lang w:val="en-US"/>
-        </w:rPr>
       </w:pPr>
       <w:bookmarkStart w:id="5" w:name="_Toc236522135"/>
       <w:r>
-        <w:rPr>
-          <w:lang w:val="en-US"/>
-        </w:rPr>
-        <w:t xml:space="preserve">Cột mốc </w:t>
-      </w:r>
-      <w:r>
-        <w:rPr>
-          <w:lang w:val="en-US"/>
-        </w:rPr>
-        <w:t>hoạt động và thành tựu tiêu biểu</w:t>
+        <w:t>Cột mốc hoạt động và thành tựu tiêu biểu</w:t>
       </w:r>
       <w:bookmarkEnd w:id="5"/>
     </w:p>
     <w:p>
       <w:pPr>
         <w:pStyle w:val="LBody"/>
+        <w:rPr>
+          <w:lang w:val="vi-VN"/>
+        </w:rPr>
       </w:pPr>
       <w:r>
         <w:rPr>
           <w:b/>
           <w:bCs/>
+          <w:lang w:val="vi-VN"/>
         </w:rPr>
         <w:t>1968:</w:t>
       </w:r>
       <w:r>
+        <w:rPr>
+          <w:lang w:val="vi-VN"/>
+        </w:rPr>
         <w:t xml:space="preserve"> Khởi đầu tại Bảo Lộc, Lâm Đồng với thương hiệu Trà &amp; Cà phê Phúc Long.</w:t>
       </w:r>
     </w:p>
     <w:p>
       <w:pPr>
         <w:pStyle w:val="LBody"/>
+        <w:rPr>
+          <w:lang w:val="vi-VN"/>
+        </w:rPr>
       </w:pPr>
       <w:r>
         <w:rPr>
           <w:b/>
           <w:bCs/>
+          <w:lang w:val="vi-VN"/>
         </w:rPr>
         <w:t>2012:</w:t>
       </w:r>
       <w:r>
+        <w:rPr>
+          <w:lang w:val="vi-VN"/>
+        </w:rPr>
         <w:t xml:space="preserve"> Khai trương cửa hàng Flagship đầu tiên tại Ngã 6 Phù Đổng (TP.HCM), tạo làn sóng thưởng thức trà sữa đậm vị.</w:t>
       </w:r>
     </w:p>
     <w:p>
       <w:pPr>
         <w:pStyle w:val="LBody"/>
+        <w:rPr>
+          <w:lang w:val="vi-VN"/>
+        </w:rPr>
       </w:pPr>
       <w:r>
         <w:rPr>
           <w:b/>
           <w:bCs/>
+          <w:lang w:val="vi-VN"/>
         </w:rPr>
         <w:t>2021:</w:t>
       </w:r>
       <w:r>
+        <w:rPr>
+          <w:lang w:val="vi-VN"/>
+        </w:rPr>
         <w:t xml:space="preserve"> Tập đoàn Masan đầu tư chiến lược, tích hợp Kiosk Phúc Long vào hệ thống siêu thị WinMart+.</w:t>
       </w:r>
     </w:p>
     <w:p>
       <w:pPr>
         <w:pStyle w:val="LBody"/>
+        <w:rPr>
+          <w:lang w:val="vi-VN"/>
+        </w:rPr>
       </w:pPr>
       <w:r>
         <w:rPr>
           <w:b/>
           <w:bCs/>
+          <w:lang w:val="vi-VN"/>
         </w:rPr>
         <w:lastRenderedPageBreak/>
         <w:t>2023–2024:</w:t>
       </w:r>
       <w:r>
+        <w:rPr>
+          <w:lang w:val="vi-VN"/>
+        </w:rPr>
         <w:t xml:space="preserve"> Đạt mốc hơn 150 cửa hàng Flagship và hàng trăm Kiosk toàn quốc, đạt doanh thu hàng ngàn tỷ đồng.</w:t>
       </w:r>
     </w:p>
@@ -6224,7 +6400,7 @@
           <w:docGrid w:linePitch="360"/>
         </w:sectPr>
       </w:pPr>
-      <w:bookmarkStart w:id="7" w:name="_Toc236523154"/>
+      <w:bookmarkStart w:id="7" w:name="_Toc236593279"/>
       <w:r>
         <w:t xml:space="preserve">Hình </w:t>
       </w:r>
@@ -6259,13 +6435,13 @@
         </w:rPr>
         <w:t>Sơ đồ Cơ cấu tổ chứ</w:t>
       </w:r>
+      <w:r>
+        <w:rPr>
+          <w:lang w:val="en-US"/>
+        </w:rPr>
+        <w:t>c</w:t>
+      </w:r>
       <w:bookmarkEnd w:id="7"/>
-      <w:r>
-        <w:rPr>
-          <w:lang w:val="en-US"/>
-        </w:rPr>
-        <w:t>c</w:t>
-      </w:r>
     </w:p>
     <w:p>
       <w:pPr>
@@ -6295,9 +6471,6 @@
     <w:p>
       <w:pPr>
         <w:pStyle w:val="Heading2"/>
-        <w:rPr>
-          <w:lang w:val="en-US"/>
-        </w:rPr>
       </w:pPr>
       <w:bookmarkStart w:id="9" w:name="_Toc236522138"/>
       <w:r>
@@ -6318,9 +6491,9 @@
           <w:lang w:val="en-US"/>
         </w:rPr>
         <w:drawing>
-          <wp:inline distT="0" distB="0" distL="0" distR="0" wp14:anchorId="0BB297AE" wp14:editId="3BB3D1B0">
+          <wp:inline distT="0" distB="0" distL="0" distR="0" wp14:anchorId="0BB297AE" wp14:editId="6E61560C">
             <wp:extent cx="5532131" cy="5257811"/>
-            <wp:effectExtent l="0" t="0" r="0" b="0"/>
+            <wp:effectExtent l="19050" t="0" r="582930" b="609600"/>
             <wp:docPr id="95694695" name="Picture 4"/>
             <wp:cNvGraphicFramePr>
               <a:graphicFrameLocks xmlns:a="http://schemas.openxmlformats.org/drawingml/2006/main" noChangeAspect="1"/>
@@ -6345,7 +6518,7 @@
                     </a:stretch>
                   </pic:blipFill>
                   <pic:spPr>
-                    <a:xfrm>
+                    <a:xfrm rot="20700000">
                       <a:off x="0" y="0"/>
                       <a:ext cx="5532131" cy="5257811"/>
                     </a:xfrm>
@@ -6367,6 +6540,7 @@
           <w:lang w:val="en-US"/>
         </w:rPr>
       </w:pPr>
+      <w:bookmarkStart w:id="10" w:name="_Toc236593280"/>
       <w:r>
         <w:t xml:space="preserve">Hình </w:t>
       </w:r>
@@ -6392,6 +6566,7 @@
       <w:r>
         <w:t>. Sơ đồ Kiến trúc quy trình nghiệp vụ</w:t>
       </w:r>
+      <w:bookmarkEnd w:id="10"/>
     </w:p>
     <w:p>
       <w:pPr>
@@ -6421,6 +6596,7 @@
           <w:lang w:val="en-US"/>
         </w:rPr>
       </w:pPr>
+      <w:bookmarkStart w:id="11" w:name="_Toc236593281"/>
       <w:r>
         <w:t xml:space="preserve">Hình </w:t>
       </w:r>
@@ -6461,6 +6637,7 @@
       <w:r>
         <w:t>oạch định chiến lược</w:t>
       </w:r>
+      <w:bookmarkEnd w:id="11"/>
     </w:p>
     <w:p>
       <w:pPr>
@@ -6470,7 +6647,7 @@
           <w:lang w:val="en-US"/>
         </w:rPr>
       </w:pPr>
-      <w:bookmarkStart w:id="10" w:name="_Toc236522139"/>
+      <w:bookmarkStart w:id="12" w:name="_Toc236522139"/>
       <w:r>
         <w:rPr>
           <w:rFonts w:eastAsia="Times New Roman" w:cs="Times New Roman"/>
@@ -6486,7 +6663,7 @@
         </w:rPr>
         <w:t>trình quản lý</w:t>
       </w:r>
-      <w:bookmarkEnd w:id="10"/>
+      <w:bookmarkEnd w:id="12"/>
       <w:r>
         <w:rPr>
           <w:rFonts w:eastAsia="Times New Roman" w:cs="Times New Roman"/>
@@ -6502,7 +6679,7 @@
           <w:lang w:val="en-US"/>
         </w:rPr>
       </w:pPr>
-      <w:bookmarkStart w:id="11" w:name="_Toc236522140"/>
+      <w:bookmarkStart w:id="13" w:name="_Toc236522140"/>
       <w:r>
         <w:rPr>
           <w:lang w:val="en-US"/>
@@ -6521,7 +6698,7 @@
         </w:rPr>
         <w:t xml:space="preserve">định chiến lược </w:t>
       </w:r>
-      <w:bookmarkEnd w:id="11"/>
+      <w:bookmarkEnd w:id="13"/>
     </w:p>
     <w:p>
       <w:pPr>
@@ -6709,13 +6886,7 @@
         <w:rPr>
           <w:highlight w:val="yellow"/>
         </w:rPr>
-        <w:t>Ban Điều hành &amp; Cổ đông Tập đoàn Masan (Khách hàng Nội bộ) - Nhận định hướng chiến lược tăng trưởng, mục tiêu doanh thu &amp; kế hoạch mở rộng mạng lưới rõ ràng</w:t>
-      </w:r>
-      <w:r>
-        <w:rPr>
-          <w:highlight w:val="yellow"/>
-        </w:rPr>
-        <w:t>.</w:t>
+        <w:t>Ban Điều hành &amp; Cổ đông Tập đoàn Masan (Khách hàng Nội bộ) - Nhận định hướng chiến lược tăng trưởng, mục tiêu doanh thu &amp; kế hoạch mở rộng mạng lưới rõ ràng.</w:t>
       </w:r>
     </w:p>
     <w:p>
@@ -6759,14 +6930,14 @@
           <w:lang w:val="en-US"/>
         </w:rPr>
       </w:pPr>
-      <w:bookmarkStart w:id="12" w:name="_Toc236522141"/>
+      <w:bookmarkStart w:id="14" w:name="_Toc236522141"/>
       <w:r>
         <w:rPr>
           <w:lang w:val="en-US"/>
         </w:rPr>
         <w:t>Quy trình Quản lý chất lượng và tiêu chuẩn dịch vụ</w:t>
       </w:r>
-      <w:bookmarkEnd w:id="12"/>
+      <w:bookmarkEnd w:id="14"/>
     </w:p>
     <w:p>
       <w:pPr>
@@ -7101,14 +7272,14 @@
           <w:lang w:val="en-US"/>
         </w:rPr>
       </w:pPr>
-      <w:bookmarkStart w:id="13" w:name="_Toc236522142"/>
+      <w:bookmarkStart w:id="15" w:name="_Toc236522142"/>
       <w:r>
         <w:rPr>
           <w:lang w:val="en-US"/>
         </w:rPr>
         <w:t>Quy trình Quản lý tài chính và ngân sách</w:t>
       </w:r>
-      <w:bookmarkEnd w:id="13"/>
+      <w:bookmarkEnd w:id="15"/>
     </w:p>
     <w:p>
       <w:pPr>
@@ -7441,7 +7612,7 @@
           <w:lang w:val="en-US"/>
         </w:rPr>
       </w:pPr>
-      <w:bookmarkStart w:id="14" w:name="_Toc236522143"/>
+      <w:bookmarkStart w:id="16" w:name="_Toc236522143"/>
       <w:r>
         <w:rPr>
           <w:lang w:val="en-US"/>
@@ -7449,7 +7620,7 @@
         <w:lastRenderedPageBreak/>
         <w:t>Quy trình cốt lõi</w:t>
       </w:r>
-      <w:bookmarkEnd w:id="14"/>
+      <w:bookmarkEnd w:id="16"/>
       <w:r>
         <w:rPr>
           <w:lang w:val="en-US"/>
@@ -7464,11 +7635,11 @@
           <w:lang w:val="en-US"/>
         </w:rPr>
       </w:pPr>
-      <w:bookmarkStart w:id="15" w:name="_Toc236522144"/>
+      <w:bookmarkStart w:id="17" w:name="_Toc236522144"/>
       <w:r>
         <w:t>Quy trình Pha chế và phục vụ đồ uống</w:t>
       </w:r>
-      <w:bookmarkEnd w:id="15"/>
+      <w:bookmarkEnd w:id="17"/>
       <w:r>
         <w:t xml:space="preserve"> </w:t>
       </w:r>
@@ -7513,13 +7684,7 @@
         <w:ind w:left="1434" w:hanging="357"/>
       </w:pPr>
       <w:r>
-        <w:t>Hệ thống</w:t>
-      </w:r>
-      <w:r>
-        <w:t xml:space="preserve"> </w:t>
-      </w:r>
-      <w:r>
-        <w:t xml:space="preserve">POS &amp; Server; </w:t>
+        <w:t xml:space="preserve">Hệ thống POS &amp; Server; </w:t>
       </w:r>
     </w:p>
     <w:p>
@@ -7537,10 +7702,7 @@
         <w:ind w:left="1434" w:hanging="357"/>
       </w:pPr>
       <w:r>
-        <w:t>Nhân viên Phục vụ / Shipper App</w:t>
-      </w:r>
-      <w:r>
-        <w:t>.</w:t>
+        <w:t>Nhân viên Phục vụ / Shipper App.</w:t>
       </w:r>
     </w:p>
     <w:p>
@@ -7924,14 +8086,14 @@
           <w:lang w:val="en-US"/>
         </w:rPr>
       </w:pPr>
-      <w:bookmarkStart w:id="16" w:name="_Toc236522145"/>
+      <w:bookmarkStart w:id="18" w:name="_Toc236522145"/>
       <w:r>
         <w:rPr>
           <w:lang w:val="en-US"/>
         </w:rPr>
         <w:t>Quy trình Vận hành chuỗi cửa hàng</w:t>
       </w:r>
-      <w:bookmarkEnd w:id="16"/>
+      <w:bookmarkEnd w:id="18"/>
     </w:p>
     <w:p>
       <w:pPr>
@@ -7972,13 +8134,7 @@
         <w:pStyle w:val="LGachDauDong"/>
       </w:pPr>
       <w:r>
-        <w:t>Quản lý Khu vực</w:t>
-      </w:r>
-      <w:r>
-        <w:t xml:space="preserve"> </w:t>
-      </w:r>
-      <w:r>
-        <w:t xml:space="preserve">(AM); </w:t>
+        <w:t xml:space="preserve">Quản lý Khu vực (AM); </w:t>
       </w:r>
     </w:p>
     <w:p>
@@ -8366,14 +8522,14 @@
           <w:lang w:val="en-US"/>
         </w:rPr>
       </w:pPr>
-      <w:bookmarkStart w:id="17" w:name="_Toc236522146"/>
+      <w:bookmarkStart w:id="19" w:name="_Toc236522146"/>
       <w:r>
         <w:rPr>
           <w:lang w:val="en-US"/>
         </w:rPr>
         <w:t>Quy trình Chăm sóc khách hàng và Quản lý phản hồi</w:t>
       </w:r>
-      <w:bookmarkEnd w:id="17"/>
+      <w:bookmarkEnd w:id="19"/>
     </w:p>
     <w:p>
       <w:pPr>
@@ -8423,21 +8579,159 @@
         <w:pStyle w:val="LGachDauDong"/>
       </w:pPr>
       <w:r>
-        <w:t>Quản</w:t>
+        <w:t xml:space="preserve">Quản lý Cửa hàng (SM); </w:t>
+      </w:r>
+    </w:p>
+    <w:p>
+      <w:pPr>
+        <w:pStyle w:val="LGachDauDong"/>
+      </w:pPr>
+      <w:r>
+        <w:t>Bộ phận Marketing/CRM.</w:t>
+      </w:r>
+    </w:p>
+    <w:p>
+      <w:pPr>
+        <w:pStyle w:val="Heading4"/>
+        <w:rPr>
+          <w:lang w:val="en-US"/>
+        </w:rPr>
+      </w:pPr>
+      <w:r>
+        <w:t>Mô tả quy trình</w:t>
+      </w:r>
+    </w:p>
+    <w:p>
+      <w:pPr>
+        <w:pStyle w:val="LBody"/>
+      </w:pPr>
+      <w:r>
+        <w:t>Bước 1 (Tiếp nhận): Tiếp nhận phản hồi/khiếu nại từ khách hàng qua Hotline</w:t>
       </w:r>
       <w:r>
         <w:t xml:space="preserve"> </w:t>
       </w:r>
       <w:r>
-        <w:t xml:space="preserve">lý Cửa hàng (SM); </w:t>
-      </w:r>
-    </w:p>
-    <w:p>
-      <w:pPr>
-        <w:pStyle w:val="LGachDauDong"/>
-      </w:pPr>
-      <w:r>
-        <w:t>Bộ phận Marketing/CRM.</w:t>
+        <w:rPr>
+          <w:lang w:val="en-US"/>
+        </w:rPr>
+        <w:t>1800.6928, Zalo Mini App, Fanpage hoặc trực tiếp tại quầy.</w:t>
+      </w:r>
+    </w:p>
+    <w:p>
+      <w:pPr>
+        <w:pStyle w:val="LBody"/>
+        <w:rPr>
+          <w:lang w:val="en-US"/>
+        </w:rPr>
+      </w:pPr>
+      <w:r>
+        <w:rPr>
+          <w:lang w:val="en-US"/>
+        </w:rPr>
+        <w:t>Bước 2 (Xác minh &amp; Phân loại): CSKH xác minh thông tin giao dịch trên hệ thống</w:t>
+      </w:r>
+      <w:r>
+        <w:rPr>
+          <w:lang w:val="en-US"/>
+        </w:rPr>
+        <w:t xml:space="preserve"> </w:t>
+      </w:r>
+      <w:r>
+        <w:rPr>
+          <w:lang w:val="en-US"/>
+        </w:rPr>
+        <w:t>CRM, phân loại khiếu nại (về thái độ phục vụ, sản phẩm sai vị, hoặc lỗi thanh toán).</w:t>
+      </w:r>
+    </w:p>
+    <w:p>
+      <w:pPr>
+        <w:pStyle w:val="LBody"/>
+        <w:rPr>
+          <w:lang w:val="en-US"/>
+        </w:rPr>
+      </w:pPr>
+      <w:r>
+        <w:rPr>
+          <w:lang w:val="en-US"/>
+        </w:rPr>
+        <w:t>Bước 3 (Chuyển xử lý): CSKH tạo ticket phản hồi và chuyển cho SM cửa hàng liên</w:t>
+      </w:r>
+      <w:r>
+        <w:rPr>
+          <w:lang w:val="en-US"/>
+        </w:rPr>
+        <w:t xml:space="preserve"> </w:t>
+      </w:r>
+      <w:r>
+        <w:rPr>
+          <w:lang w:val="en-US"/>
+        </w:rPr>
+        <w:t>quan kiểm tra camera/lịch sử ca bán trong 2 giờ.</w:t>
+      </w:r>
+    </w:p>
+    <w:p>
+      <w:pPr>
+        <w:pStyle w:val="LBody"/>
+        <w:rPr>
+          <w:lang w:val="en-US"/>
+        </w:rPr>
+      </w:pPr>
+      <w:r>
+        <w:rPr>
+          <w:lang w:val="en-US"/>
+        </w:rPr>
+        <w:t>Bước 4 (Đề xuất giải pháp): SM đề xuất phương án giải quyết: Đổi trả ly nước mới, gửi</w:t>
+      </w:r>
+      <w:r>
+        <w:rPr>
+          <w:lang w:val="en-US"/>
+        </w:rPr>
+        <w:t xml:space="preserve"> </w:t>
+      </w:r>
+      <w:r>
+        <w:rPr>
+          <w:lang w:val="en-US"/>
+        </w:rPr>
+        <w:t>lời xin lỗi và phát hành Voucher đền bù trên Phúc Long Rewards.Bước 5 (Trao đổi với khách): CSKH liên hệ trực tiếp phản hồi giải pháp với khách hàng.</w:t>
+      </w:r>
+      <w:r>
+        <w:rPr>
+          <w:lang w:val="en-US"/>
+        </w:rPr>
+        <w:t xml:space="preserve"> </w:t>
+      </w:r>
+      <w:r>
+        <w:rPr>
+          <w:lang w:val="en-US"/>
+        </w:rPr>
+        <w:t>Nếu khách chưa hài lòng -&gt; SM điều chỉnh phương án.</w:t>
+      </w:r>
+    </w:p>
+    <w:p>
+      <w:pPr>
+        <w:pStyle w:val="LBody"/>
+        <w:rPr>
+          <w:lang w:val="en-US"/>
+        </w:rPr>
+      </w:pPr>
+      <w:r>
+        <w:rPr>
+          <w:lang w:val="en-US"/>
+        </w:rPr>
+        <w:t>Bước 6 (Đóng ticket &amp; Đánh giá): Khi khách hàng đồng ý, CSKH đóng ticket khiếu nại</w:t>
+      </w:r>
+      <w:r>
+        <w:rPr>
+          <w:lang w:val="en-US"/>
+        </w:rPr>
+        <w:t xml:space="preserve"> </w:t>
+      </w:r>
+      <w:r>
+        <w:rPr>
+          <w:lang w:val="en-US"/>
+        </w:rPr>
+        <w:t>và gửi khảo sát đánh giá chất lượng dịch vụ 1-5 sao.</w:t>
       </w:r>
     </w:p>
     <w:p>
@@ -8448,230 +8742,86 @@
         </w:rPr>
       </w:pPr>
       <w:r>
-        <w:t>Mô tả quy trình</w:t>
+        <w:rPr>
+          <w:lang w:val="en-US"/>
+        </w:rPr>
+        <w:t>Đối tượng khách hàng</w:t>
       </w:r>
     </w:p>
     <w:p>
       <w:pPr>
         <w:pStyle w:val="LBody"/>
-      </w:pPr>
-      <w:r>
-        <w:t>Bước 1 (Tiếp nhận): Tiếp nhận phản hồi/khiếu nại từ khách hàng qua Hotline</w:t>
-      </w:r>
-      <w:r>
+        <w:rPr>
+          <w:lang w:val="en-US"/>
+        </w:rPr>
+      </w:pPr>
+      <w:r>
+        <w:rPr>
+          <w:lang w:val="en-US"/>
+        </w:rPr>
+        <w:t>Khách hàng thành viên Phúc Long</w:t>
+      </w:r>
+      <w:r>
+        <w:rPr>
+          <w:lang w:val="en-US"/>
+        </w:rPr>
         <w:t xml:space="preserve"> </w:t>
       </w:r>
       <w:r>
         <w:rPr>
           <w:lang w:val="en-US"/>
         </w:rPr>
-        <w:t>1800.6928, Zalo Mini App, Fanpage hoặc trực tiếp tại quầy.</w:t>
+        <w:t>Rewards (Khách hàng Bên ngoài) - Được giải quyết khiếu nại thỏa đáng, bảo vệ quyền</w:t>
+      </w:r>
+      <w:r>
+        <w:rPr>
+          <w:lang w:val="en-US"/>
+        </w:rPr>
+        <w:t xml:space="preserve"> </w:t>
+      </w:r>
+      <w:r>
+        <w:rPr>
+          <w:lang w:val="en-US"/>
+        </w:rPr>
+        <w:t>lợi và nhận ưu đãi cá nhân hóa.</w:t>
+      </w:r>
+    </w:p>
+    <w:p>
+      <w:pPr>
+        <w:pStyle w:val="Heading4"/>
+        <w:rPr>
+          <w:lang w:val="en-US"/>
+        </w:rPr>
+      </w:pPr>
+      <w:r>
+        <w:t>Kết quả có thể xảy ra của quy trình</w:t>
       </w:r>
     </w:p>
     <w:p>
       <w:pPr>
         <w:pStyle w:val="LBody"/>
-        <w:rPr>
-          <w:lang w:val="en-US"/>
-        </w:rPr>
-      </w:pPr>
-      <w:r>
-        <w:rPr>
-          <w:lang w:val="en-US"/>
-        </w:rPr>
-        <w:t>Bước 2 (Xác minh &amp; Phân loại): CSKH xác minh thông tin giao dịch trên hệ thống</w:t>
-      </w:r>
-      <w:r>
-        <w:rPr>
-          <w:lang w:val="en-US"/>
-        </w:rPr>
+      </w:pPr>
+      <w:r>
+        <w:t>Trường hợp thành công: Khiếu nại được xử lý êm đẹp trong 24 giờ, khách hàng hài</w:t>
+      </w:r>
+      <w:r>
         <w:t xml:space="preserve"> </w:t>
       </w:r>
       <w:r>
-        <w:rPr>
-          <w:lang w:val="en-US"/>
-        </w:rPr>
-        <w:t>CRM, phân loại khiếu nại (về thái độ phục vụ, sản phẩm sai vị, hoặc lỗi thanh toán).</w:t>
+        <w:t>lòng đánh giá 5 sao và tiếp tục quay lại sử dụng dịch vụ.</w:t>
       </w:r>
     </w:p>
     <w:p>
       <w:pPr>
         <w:pStyle w:val="LBody"/>
-        <w:rPr>
-          <w:lang w:val="en-US"/>
-        </w:rPr>
-      </w:pPr>
-      <w:r>
-        <w:rPr>
-          <w:lang w:val="en-US"/>
-        </w:rPr>
-        <w:t>Bước 3 (Chuyển xử lý): CSKH tạo ticket phản hồi và chuyển cho SM cửa hàng liên</w:t>
-      </w:r>
-      <w:r>
-        <w:rPr>
-          <w:lang w:val="en-US"/>
-        </w:rPr>
+      </w:pPr>
+      <w:r>
+        <w:t>Trường hợp thất bại/rủi ro: Xử lý trễ hạn hoặc thái độ không thỏa đáng khiến khách</w:t>
+      </w:r>
+      <w:r>
         <w:t xml:space="preserve"> </w:t>
       </w:r>
       <w:r>
-        <w:rPr>
-          <w:lang w:val="en-US"/>
-        </w:rPr>
-        <w:t>quan kiểm tra camera/lịch sử ca bán trong 2 giờ.</w:t>
-      </w:r>
-    </w:p>
-    <w:p>
-      <w:pPr>
-        <w:pStyle w:val="LBody"/>
-        <w:rPr>
-          <w:lang w:val="en-US"/>
-        </w:rPr>
-      </w:pPr>
-      <w:r>
-        <w:rPr>
-          <w:lang w:val="en-US"/>
-        </w:rPr>
-        <w:t>Bước 4 (Đề xuất giải pháp): SM đề xuất phương án giải quyết: Đổi trả ly nước mới, gửi</w:t>
-      </w:r>
-      <w:r>
-        <w:rPr>
-          <w:lang w:val="en-US"/>
-        </w:rPr>
-        <w:t xml:space="preserve"> </w:t>
-      </w:r>
-      <w:r>
-        <w:rPr>
-          <w:lang w:val="en-US"/>
-        </w:rPr>
-        <w:t>lời xin lỗi và phát hành Voucher đền bù trên Phúc Long Rewards.Bước 5 (Trao đổi với khách): CSKH liên hệ trực tiếp phản hồi giải pháp với khách hàng.</w:t>
-      </w:r>
-      <w:r>
-        <w:rPr>
-          <w:lang w:val="en-US"/>
-        </w:rPr>
-        <w:t xml:space="preserve"> </w:t>
-      </w:r>
-      <w:r>
-        <w:rPr>
-          <w:lang w:val="en-US"/>
-        </w:rPr>
-        <w:t>Nếu khách chưa hài lòng -&gt; SM điều chỉnh phương án.</w:t>
-      </w:r>
-    </w:p>
-    <w:p>
-      <w:pPr>
-        <w:pStyle w:val="LBody"/>
-        <w:rPr>
-          <w:lang w:val="en-US"/>
-        </w:rPr>
-      </w:pPr>
-      <w:r>
-        <w:rPr>
-          <w:lang w:val="en-US"/>
-        </w:rPr>
-        <w:t>Bước 6 (Đóng ticket &amp; Đánh giá): Khi khách hàng đồng ý, CSKH đóng ticket khiếu nại</w:t>
-      </w:r>
-      <w:r>
-        <w:rPr>
-          <w:lang w:val="en-US"/>
-        </w:rPr>
-        <w:t xml:space="preserve"> </w:t>
-      </w:r>
-      <w:r>
-        <w:rPr>
-          <w:lang w:val="en-US"/>
-        </w:rPr>
-        <w:t>và gửi khảo sát đánh giá chất lượng dịch vụ 1-5 sao.</w:t>
-      </w:r>
-    </w:p>
-    <w:p>
-      <w:pPr>
-        <w:pStyle w:val="Heading4"/>
-        <w:rPr>
-          <w:lang w:val="en-US"/>
-        </w:rPr>
-      </w:pPr>
-      <w:r>
-        <w:rPr>
-          <w:lang w:val="en-US"/>
-        </w:rPr>
-        <w:t>Đối tượng khách hàng</w:t>
-      </w:r>
-    </w:p>
-    <w:p>
-      <w:pPr>
-        <w:pStyle w:val="LBody"/>
-        <w:rPr>
-          <w:lang w:val="en-US"/>
-        </w:rPr>
-      </w:pPr>
-      <w:r>
-        <w:rPr>
-          <w:lang w:val="en-US"/>
-        </w:rPr>
-        <w:t>Khách hàng thành viên Phúc Long</w:t>
-      </w:r>
-      <w:r>
-        <w:rPr>
-          <w:lang w:val="en-US"/>
-        </w:rPr>
-        <w:t xml:space="preserve"> </w:t>
-      </w:r>
-      <w:r>
-        <w:rPr>
-          <w:lang w:val="en-US"/>
-        </w:rPr>
-        <w:t>Rewards (Khách hàng Bên ngoài) - Được giải quyết khiếu nại thỏa đáng, bảo vệ quyền</w:t>
-      </w:r>
-      <w:r>
-        <w:rPr>
-          <w:lang w:val="en-US"/>
-        </w:rPr>
-        <w:t xml:space="preserve"> </w:t>
-      </w:r>
-      <w:r>
-        <w:rPr>
-          <w:lang w:val="en-US"/>
-        </w:rPr>
-        <w:t>lợi và nhận ưu đãi cá nhân hóa.</w:t>
-      </w:r>
-    </w:p>
-    <w:p>
-      <w:pPr>
-        <w:pStyle w:val="Heading4"/>
-        <w:rPr>
-          <w:lang w:val="en-US"/>
-        </w:rPr>
-      </w:pPr>
-      <w:r>
-        <w:t>Kết quả có thể xảy ra của quy trình</w:t>
-      </w:r>
-    </w:p>
-    <w:p>
-      <w:pPr>
-        <w:pStyle w:val="LBody"/>
-      </w:pPr>
-      <w:r>
-        <w:t>Trường hợp thành công: Khiếu nại được xử lý êm đẹp trong 24 giờ, khách hàng hài</w:t>
-      </w:r>
-      <w:r>
-        <w:t xml:space="preserve"> </w:t>
-      </w:r>
-      <w:r>
-        <w:t>lòng đánh giá 5 sao và tiếp tục quay lại sử dụng dịch vụ.</w:t>
-      </w:r>
-    </w:p>
-    <w:p>
-      <w:pPr>
-        <w:pStyle w:val="LBody"/>
-      </w:pPr>
-      <w:r>
-        <w:t>Trường hợp thất bại/rủi ro: Xử lý trễ hạn hoặc thái độ không thỏa đáng khiến khách</w:t>
-      </w:r>
-      <w:r>
-        <w:t xml:space="preserve"> </w:t>
-      </w:r>
-      <w:r>
         <w:t>hàng bức xúc đăng bài tiêu cực lên mạng xã hội.</w:t>
       </w:r>
     </w:p>
@@ -8682,12 +8832,12 @@
           <w:lang w:val="en-US"/>
         </w:rPr>
       </w:pPr>
-      <w:bookmarkStart w:id="18" w:name="_Toc236522147"/>
+      <w:bookmarkStart w:id="20" w:name="_Toc236522147"/>
       <w:r>
         <w:lastRenderedPageBreak/>
         <w:t>Quy trình Quản lý đơn hàng và giao hàng đa kênh</w:t>
       </w:r>
-      <w:bookmarkEnd w:id="18"/>
+      <w:bookmarkEnd w:id="20"/>
     </w:p>
     <w:p>
       <w:pPr>
@@ -9020,7 +9170,7 @@
           <w:lang w:val="en-US"/>
         </w:rPr>
       </w:pPr>
-      <w:bookmarkStart w:id="19" w:name="_Toc236522148"/>
+      <w:bookmarkStart w:id="21" w:name="_Toc236522148"/>
       <w:r>
         <w:rPr>
           <w:lang w:val="en-US"/>
@@ -9028,7 +9178,7 @@
         <w:lastRenderedPageBreak/>
         <w:t>Quy trình hỗ trợ</w:t>
       </w:r>
-      <w:bookmarkEnd w:id="19"/>
+      <w:bookmarkEnd w:id="21"/>
     </w:p>
     <w:p>
       <w:pPr>
@@ -9037,11 +9187,11 @@
           <w:lang w:val="en-US"/>
         </w:rPr>
       </w:pPr>
-      <w:bookmarkStart w:id="20" w:name="_Toc236522149"/>
+      <w:bookmarkStart w:id="22" w:name="_Toc236522149"/>
       <w:r>
         <w:t>Quy trình Tuyển dụng và đào tạo nhân sự</w:t>
       </w:r>
-      <w:bookmarkEnd w:id="20"/>
+      <w:bookmarkEnd w:id="22"/>
     </w:p>
     <w:p>
       <w:pPr>
@@ -9082,13 +9232,7 @@
         <w:pStyle w:val="LGachDauDong"/>
       </w:pPr>
       <w:r>
-        <w:t>Bộ phận Nhân sự</w:t>
-      </w:r>
-      <w:r>
-        <w:t xml:space="preserve"> </w:t>
-      </w:r>
-      <w:r>
-        <w:t xml:space="preserve">(HR); </w:t>
+        <w:t xml:space="preserve">Bộ phận Nhân sự (HR); </w:t>
       </w:r>
     </w:p>
     <w:p>
@@ -9425,11 +9569,11 @@
           <w:lang w:val="en-US"/>
         </w:rPr>
       </w:pPr>
-      <w:bookmarkStart w:id="21" w:name="_Toc236522150"/>
+      <w:bookmarkStart w:id="23" w:name="_Toc236522150"/>
       <w:r>
         <w:t>Quy trình Quản lý chuỗi cung ứng và kho vận</w:t>
       </w:r>
-      <w:bookmarkEnd w:id="21"/>
+      <w:bookmarkEnd w:id="23"/>
     </w:p>
     <w:p>
       <w:pPr>
@@ -9470,13 +9614,7 @@
         <w:pStyle w:val="LGachDauDong"/>
       </w:pPr>
       <w:r>
-        <w:t>Nhà máy Sản xuất (Bình</w:t>
-      </w:r>
-      <w:r>
-        <w:t xml:space="preserve"> </w:t>
-      </w:r>
-      <w:r>
-        <w:t xml:space="preserve">Dương); </w:t>
+        <w:t xml:space="preserve">Nhà máy Sản xuất (Bình Dương); </w:t>
       </w:r>
     </w:p>
     <w:p>
@@ -9799,11 +9937,11 @@
           <w:lang w:val="en-US"/>
         </w:rPr>
       </w:pPr>
-      <w:bookmarkStart w:id="22" w:name="_Toc236522151"/>
+      <w:bookmarkStart w:id="24" w:name="_Toc236522151"/>
       <w:r>
         <w:t>Quy trình Bảo trì thiết bị và cơ sở vật chất</w:t>
       </w:r>
-      <w:bookmarkEnd w:id="22"/>
+      <w:bookmarkEnd w:id="24"/>
     </w:p>
     <w:p>
       <w:pPr>
@@ -9858,13 +9996,7 @@
         <w:pStyle w:val="LGachDauDong"/>
       </w:pPr>
       <w:r>
-        <w:t>Đội ngũ Kỹ thuật Bảo trì</w:t>
-      </w:r>
-      <w:r>
-        <w:t xml:space="preserve"> </w:t>
-      </w:r>
-      <w:r>
-        <w:t xml:space="preserve">Nội bộ; </w:t>
+        <w:t xml:space="preserve">Đội ngũ Kỹ thuật Bảo trì Nội bộ; </w:t>
       </w:r>
     </w:p>
     <w:p>
@@ -10054,11 +10186,11 @@
           <w:lang w:val="en-US"/>
         </w:rPr>
       </w:pPr>
-      <w:bookmarkStart w:id="23" w:name="_Toc236522152"/>
+      <w:bookmarkStart w:id="25" w:name="_Toc236522152"/>
       <w:r>
         <w:t>Quy trình Hỗ trợ công nghệ thông tin IT Helpdesk</w:t>
       </w:r>
-      <w:bookmarkEnd w:id="23"/>
+      <w:bookmarkEnd w:id="25"/>
     </w:p>
     <w:p>
       <w:pPr>
@@ -10107,13 +10239,7 @@
         <w:pStyle w:val="LGachDauDong"/>
       </w:pPr>
       <w:r>
-        <w:t>Đội ngũ IT Helpdesk</w:t>
-      </w:r>
-      <w:r>
-        <w:t xml:space="preserve"> </w:t>
-      </w:r>
-      <w:r>
-        <w:t xml:space="preserve">Trung tâm; </w:t>
+        <w:t xml:space="preserve">Đội ngũ IT Helpdesk Trung tâm; </w:t>
       </w:r>
     </w:p>
     <w:p>
@@ -10325,12 +10451,12 @@
       <w:pPr>
         <w:pStyle w:val="Heading1"/>
       </w:pPr>
-      <w:bookmarkStart w:id="24" w:name="_Toc236522153"/>
+      <w:bookmarkStart w:id="26" w:name="_Toc236522153"/>
       <w:r>
         <w:lastRenderedPageBreak/>
         <w:t>Mô hình hoá quy trình</w:t>
       </w:r>
-      <w:bookmarkEnd w:id="24"/>
+      <w:bookmarkEnd w:id="26"/>
     </w:p>
     <w:p>
       <w:pPr>
@@ -10340,7 +10466,7 @@
           <w:lang w:val="en-US"/>
         </w:rPr>
       </w:pPr>
-      <w:bookmarkStart w:id="25" w:name="_Toc236522154"/>
+      <w:bookmarkStart w:id="27" w:name="_Toc236522154"/>
       <w:r>
         <w:rPr>
           <w:rFonts w:cs="Times New Roman"/>
@@ -10348,7 +10474,7 @@
         </w:rPr>
         <w:t>Quy trình quản lý</w:t>
       </w:r>
-      <w:bookmarkEnd w:id="25"/>
+      <w:bookmarkEnd w:id="27"/>
     </w:p>
     <w:p>
       <w:pPr>
@@ -10364,14 +10490,14 @@
           <w:lang w:val="en-US"/>
         </w:rPr>
       </w:pPr>
-      <w:bookmarkStart w:id="26" w:name="_Toc236522155"/>
+      <w:bookmarkStart w:id="28" w:name="_Toc236522155"/>
       <w:r>
         <w:rPr>
           <w:lang w:val="en-US"/>
         </w:rPr>
         <w:t>Quy trình cốt lõi</w:t>
       </w:r>
-      <w:bookmarkEnd w:id="26"/>
+      <w:bookmarkEnd w:id="28"/>
       <w:r>
         <w:rPr>
           <w:lang w:val="en-US"/>
@@ -10393,14 +10519,14 @@
           <w:lang w:val="en-US"/>
         </w:rPr>
       </w:pPr>
-      <w:bookmarkStart w:id="27" w:name="_Toc236522156"/>
+      <w:bookmarkStart w:id="29" w:name="_Toc236522156"/>
       <w:r>
         <w:rPr>
           <w:lang w:val="en-US"/>
         </w:rPr>
         <w:t>Quy trình hỗ trợ</w:t>
       </w:r>
-      <w:bookmarkEnd w:id="27"/>
+      <w:bookmarkEnd w:id="29"/>
     </w:p>
     <w:p>
       <w:pPr>
@@ -10420,12 +10546,12 @@
       <w:pPr>
         <w:pStyle w:val="Heading1"/>
       </w:pPr>
-      <w:bookmarkStart w:id="28" w:name="_Toc236522157"/>
+      <w:bookmarkStart w:id="30" w:name="_Toc236522157"/>
       <w:r>
         <w:lastRenderedPageBreak/>
         <w:t>Phân tích quy trình</w:t>
       </w:r>
-      <w:bookmarkEnd w:id="28"/>
+      <w:bookmarkEnd w:id="30"/>
     </w:p>
     <w:p>
       <w:pPr>
@@ -10434,14 +10560,14 @@
           <w:lang w:val="en-US"/>
         </w:rPr>
       </w:pPr>
-      <w:bookmarkStart w:id="29" w:name="_Toc236522158"/>
+      <w:bookmarkStart w:id="31" w:name="_Toc236522158"/>
       <w:r>
         <w:rPr>
           <w:lang w:val="en-US"/>
         </w:rPr>
         <w:t>Phân tích định tính</w:t>
       </w:r>
-      <w:bookmarkEnd w:id="29"/>
+      <w:bookmarkEnd w:id="31"/>
     </w:p>
     <w:p>
       <w:pPr>
@@ -10450,7 +10576,7 @@
           <w:lang w:val="en-US"/>
         </w:rPr>
       </w:pPr>
-      <w:bookmarkStart w:id="30" w:name="_Toc236522159"/>
+      <w:bookmarkStart w:id="32" w:name="_Toc236522159"/>
       <w:r>
         <w:rPr>
           <w:lang w:val="en-US"/>
@@ -10460,7 +10586,7 @@
       <w:r>
         <w:t>Pha chế và phục vụ đồ uống</w:t>
       </w:r>
-      <w:bookmarkEnd w:id="30"/>
+      <w:bookmarkEnd w:id="32"/>
     </w:p>
     <w:p>
       <w:pPr>
@@ -10534,14 +10660,14 @@
           <w:lang w:val="en-US"/>
         </w:rPr>
       </w:pPr>
-      <w:bookmarkStart w:id="31" w:name="_Toc236522160"/>
+      <w:bookmarkStart w:id="33" w:name="_Toc236522160"/>
       <w:r>
         <w:rPr>
           <w:lang w:val="en-US"/>
         </w:rPr>
         <w:t>Quy trình …</w:t>
       </w:r>
-      <w:bookmarkEnd w:id="31"/>
+      <w:bookmarkEnd w:id="33"/>
     </w:p>
     <w:p>
       <w:pPr>
@@ -10557,14 +10683,14 @@
           <w:lang w:val="en-US"/>
         </w:rPr>
       </w:pPr>
-      <w:bookmarkStart w:id="32" w:name="_Toc236522161"/>
+      <w:bookmarkStart w:id="34" w:name="_Toc236522161"/>
       <w:r>
         <w:rPr>
           <w:lang w:val="en-US"/>
         </w:rPr>
         <w:t>Phân tích định lượng</w:t>
       </w:r>
-      <w:bookmarkEnd w:id="32"/>
+      <w:bookmarkEnd w:id="34"/>
     </w:p>
     <w:p>
       <w:pPr>
@@ -10573,14 +10699,14 @@
           <w:lang w:val="en-US"/>
         </w:rPr>
       </w:pPr>
-      <w:bookmarkStart w:id="33" w:name="_Toc236522162"/>
+      <w:bookmarkStart w:id="35" w:name="_Toc236522162"/>
       <w:r>
         <w:rPr>
           <w:lang w:val="en-US"/>
         </w:rPr>
         <w:t>Quy trình …</w:t>
       </w:r>
-      <w:bookmarkEnd w:id="33"/>
+      <w:bookmarkEnd w:id="35"/>
     </w:p>
     <w:p>
       <w:pPr>
@@ -11629,6 +11755,7 @@
   <w:style w:type="character" w:default="1" w:styleId="DefaultParagraphFont">
     <w:name w:val="Default Paragraph Font"/>
     <w:uiPriority w:val="1"/>
+    <w:semiHidden/>
     <w:unhideWhenUsed/>
   </w:style>
   <w:style w:type="table" w:default="1" w:styleId="TableNormal">

</xml_diff>

<commit_message>
họp 8/8 chốt và bỏ toàn bộ nội dung vào báo cáo
</commit_message>
<xml_diff>
--- a/report/Báo cáo.docx
+++ b/report/Báo cáo.docx
@@ -1070,21 +1070,7 @@
             <w:rStyle w:val="Hyperlink"/>
             <w:noProof/>
           </w:rPr>
-          <w:t xml:space="preserve">1.2. Sứ mệnh và </w:t>
-        </w:r>
-        <w:r>
-          <w:rPr>
-            <w:rStyle w:val="Hyperlink"/>
-            <w:noProof/>
-          </w:rPr>
-          <w:t>g</w:t>
-        </w:r>
-        <w:r>
-          <w:rPr>
-            <w:rStyle w:val="Hyperlink"/>
-            <w:noProof/>
-          </w:rPr>
-          <w:t>iá trị cốt lõi</w:t>
+          <w:t>1.2. Sứ mệnh và giá trị cốt lõi</w:t>
         </w:r>
         <w:r>
           <w:rPr>
@@ -7693,6 +7679,7 @@
     <w:p>
       <w:pPr>
         <w:spacing w:before="0" w:after="200" w:line="276" w:lineRule="auto"/>
+        <w:ind w:left="-1418"/>
         <w:rPr>
           <w:lang w:val="en-US"/>
         </w:rPr>
@@ -12092,6 +12079,7 @@
   <w:style w:type="character" w:default="1" w:styleId="DefaultParagraphFont">
     <w:name w:val="Default Paragraph Font"/>
     <w:uiPriority w:val="1"/>
+    <w:semiHidden/>
     <w:unhideWhenUsed/>
   </w:style>
   <w:style w:type="table" w:default="1" w:styleId="TableNormal">

</xml_diff>

<commit_message>
cập nhật 1/2 - 10/8
</commit_message>
<xml_diff>
--- a/report/Báo cáo.docx
+++ b/report/Báo cáo.docx
@@ -22462,20 +22462,84 @@
     </w:p>
     <w:p>
       <w:pPr>
-        <w:rPr>
-          <w:rFonts w:cs="Times New Roman"/>
-          <w:szCs w:val="26"/>
-          <w:lang w:val="en-US"/>
-        </w:rPr>
-      </w:pPr>
-      <w:r>
-        <w:rPr>
-          <w:rFonts w:cs="Times New Roman"/>
-          <w:szCs w:val="26"/>
-          <w:lang w:val="en-US"/>
-        </w:rPr>
-        <w:t>Theo chuẩn IEEE</w:t>
-      </w:r>
+        <w:pStyle w:val="Subtitle"/>
+      </w:pPr>
+      <w:r>
+        <w:t xml:space="preserve">[1] Phúc Long Coffee &amp; Tea, </w:t>
+      </w:r>
+      <w:r>
+        <w:rPr>
+          <w:lang w:val="en-US"/>
+        </w:rPr>
+        <w:t>“</w:t>
+      </w:r>
+      <w:r>
+        <w:t>Trang thông tin chính thức,”</w:t>
+      </w:r>
+      <w:r>
+        <w:rPr>
+          <w:lang w:val="en-US"/>
+        </w:rPr>
+        <w:t xml:space="preserve"> </w:t>
+      </w:r>
+      <w:r>
+        <w:t>https://www.phuclong.com.vn/ (truy cập ngày 09/08/2026).</w:t>
+      </w:r>
+    </w:p>
+    <w:p>
+      <w:pPr>
+        <w:pStyle w:val="Subtitle"/>
+      </w:pPr>
+      <w:r>
+        <w:t>[2] Masan Group, “About Us - Phuc Long Heritage,” https://www.masangroup.com/about-us/ (truy cập ngày 09/08/2026).</w:t>
+      </w:r>
+    </w:p>
+    <w:p>
+      <w:pPr>
+        <w:pStyle w:val="Subtitle"/>
+      </w:pPr>
+      <w:r>
+        <w:t>[3] Masan Group, “Record Profit in 2025; Masan Targets Double-Digit Earnings Growth in 2026,” 2026,</w:t>
+      </w:r>
+      <w:r>
+        <w:rPr>
+          <w:lang w:val="en-US"/>
+        </w:rPr>
+        <w:t xml:space="preserve"> </w:t>
+      </w:r>
+      <w:r>
+        <w:t>https://www.masangroup.com/news/masan-news/record-profit-in-2025-masan-targets-double-digit-earnings-growth-in-2026/.</w:t>
+      </w:r>
+    </w:p>
+    <w:p>
+      <w:pPr>
+        <w:pStyle w:val="Subtitle"/>
+      </w:pPr>
+      <w:r>
+        <w:t>[4] Object Management Group, “Business Process Model and Notation (BPMN), Version 2.0,” https://www.omg.org/spec/BPMN/2.0/.</w:t>
+      </w:r>
+    </w:p>
+    <w:p>
+      <w:pPr>
+        <w:pStyle w:val="Subtitle"/>
+      </w:pPr>
+      <w:r>
+        <w:t>[</w:t>
+      </w:r>
+      <w:r>
+        <w:rPr>
+          <w:lang w:val="en-US"/>
+        </w:rPr>
+        <w:t>5</w:t>
+      </w:r>
+      <w:r>
+        <w:t>] “BPMN 2.0 Poster,” BPM Offensive Berlin / Hasso Plattner Institute, tệp PDF tham khảo do nhóm cung cấp.</w:t>
+      </w:r>
+    </w:p>
+    <w:p>
+      <w:pPr>
+        <w:pStyle w:val="Subtitle"/>
+      </w:pPr>
     </w:p>
     <w:sectPr>
       <w:pgSz w:w="11906" w:h="16838"/>
@@ -23992,18 +24056,17 @@
     <w:link w:val="SubtitleChar"/>
     <w:uiPriority w:val="11"/>
     <w:qFormat/>
-    <w:rsid w:val="00A5181A"/>
+    <w:rsid w:val="00AB6370"/>
     <w:pPr>
       <w:numPr>
         <w:ilvl w:val="1"/>
       </w:numPr>
-      <w:spacing w:after="160"/>
+      <w:ind w:firstLine="357"/>
     </w:pPr>
     <w:rPr>
-      <w:rFonts w:asciiTheme="minorHAnsi" w:eastAsiaTheme="minorEastAsia" w:hAnsiTheme="minorHAnsi"/>
-      <w:color w:val="5A5A5A" w:themeColor="text1" w:themeTint="A5"/>
+      <w:rFonts w:eastAsiaTheme="minorEastAsia"/>
+      <w:color w:val="000000" w:themeColor="text1"/>
       <w:spacing w:val="15"/>
-      <w:sz w:val="22"/>
     </w:rPr>
   </w:style>
   <w:style w:type="character" w:customStyle="1" w:styleId="SubtitleChar">
@@ -24011,11 +24074,12 @@
     <w:basedOn w:val="DefaultParagraphFont"/>
     <w:link w:val="Subtitle"/>
     <w:uiPriority w:val="11"/>
-    <w:rsid w:val="00A5181A"/>
+    <w:rsid w:val="00AB6370"/>
     <w:rPr>
-      <w:rFonts w:eastAsiaTheme="minorEastAsia"/>
-      <w:color w:val="5A5A5A" w:themeColor="text1" w:themeTint="A5"/>
+      <w:rFonts w:ascii="Times New Roman" w:eastAsiaTheme="minorEastAsia" w:hAnsi="Times New Roman"/>
+      <w:color w:val="000000" w:themeColor="text1"/>
       <w:spacing w:val="15"/>
+      <w:sz w:val="26"/>
     </w:rPr>
   </w:style>
   <w:style w:type="paragraph" w:customStyle="1" w:styleId="LBody">

</xml_diff>